<commit_message>
Assessment V2: Thornfield RCM Exercise (trainee copy) and Stakeholder Panel Brief moved to Advanced sessions 3 and 12
Co-Authored-By: Claude Opus 5.5 <noreply@anthropic.com>
Claude-Session: https://claude.ai/code/session_018fWq9UNCNi5rGqwUiTA1Zk
</commit_message>
<xml_diff>
--- a/materials/05-assessment/TIB-FS-ASSESS-004A_Midpoint-RCM-Exercise_Trainee-Copy.docx
+++ b/materials/05-assessment/TIB-FS-ASSESS-004A_Midpoint-RCM-Exercise_Trainee-Copy.docx
@@ -31,7 +31,7 @@
           <w:sz w:val="40"/>
           <w:szCs w:val="40"/>
         </w:rPr>
-        <w:t xml:space="preserve">Midpoint RCM Exercise</w:t>
+        <w:t>Thornfield RCM Exercise</w:t>
       </w:r>
     </w:p>
     <w:p>
@@ -47,7 +47,7 @@
           <w:sz w:val="23"/>
           <w:szCs w:val="23"/>
         </w:rPr>
-        <w:t xml:space="preserve">Session 11 — build the Thornfield Risk &amp; Control Matrix from everything tested in sessions 2–10</w:t>
+        <w:t>Advanced session 3 — build the Thornfield Risk &amp; Control Matrix from the controls tested at Intermediate</w:t>
       </w:r>
     </w:p>
     <w:tbl>
@@ -343,7 +343,7 @@
                 <w:sz w:val="19"/>
                 <w:szCs w:val="19"/>
               </w:rPr>
-              <w:t xml:space="preserve">V1 — October 2026 restructure</w:t>
+              <w:t>V2 — October 2026 · two-level plan</w:t>
             </w:r>
           </w:p>
         </w:tc>
@@ -526,7 +526,7 @@
           <w:sz w:val="21"/>
           <w:szCs w:val="21"/>
         </w:rPr>
-        <w:t xml:space="preserve">In session 11 you turn the controls you have tested so far into a Risk &amp; Control Matrix — the document a manager uses to scope a whole engagement (Book 36).</w:t>
+        <w:t>In Advanced session 3 you turn the controls tested at Intermediate into a Risk &amp; Control Matrix — the document a manager uses to scope a whole engagement (Book 36).</w:t>
       </w:r>
     </w:p>
     <w:p>
@@ -580,7 +580,7 @@
           <w:sz w:val="21"/>
           <w:szCs w:val="21"/>
         </w:rPr>
-        <w:t xml:space="preserve">Hand in at the end of session 11. Marked and returned in session 12; recorded as item = rcm.</w:t>
+        <w:t>Submit by 23:59 CT on the day of Advanced session 3. Marked and returned at Advanced session 5; recorded as item = rcm.</w:t>
       </w:r>
     </w:p>
     <w:p>

</xml_diff>